<commit_message>
feat: implement backend service architecture and ML service components while removing docker-compose configuration.
</commit_message>
<xml_diff>
--- a/Deliverable/Write UP.docx
+++ b/Deliverable/Write UP.docx
@@ -375,55 +375,11 @@
         </w:rPr>
       </w:pPr>
       <w:r>
-        <w:t>Title</w:t>
-      </w:r>
-      <w:r>
-        <w:rPr>
-          <w:spacing w:val="-12"/>
-        </w:rPr>
-        <w:t xml:space="preserve"> </w:t>
-      </w:r>
-      <w:r>
-        <w:t>of</w:t>
-      </w:r>
-      <w:r>
-        <w:rPr>
-          <w:spacing w:val="-10"/>
-        </w:rPr>
-        <w:t xml:space="preserve"> </w:t>
-      </w:r>
-      <w:r>
-        <w:t>the</w:t>
-      </w:r>
-      <w:r>
-        <w:rPr>
-          <w:spacing w:val="-9"/>
-        </w:rPr>
-        <w:t xml:space="preserve"> </w:t>
-      </w:r>
-      <w:r>
-        <w:rPr>
-          <w:spacing w:val="-2"/>
-        </w:rPr>
-        <w:t>Project</w:t>
-      </w:r>
-      <w:r>
+        <w:t>Title of the Project</w:t>
         <w:tab/>
-      </w:r>
-      <w:r>
-        <w:rPr>
-          <w:spacing w:val="-10"/>
-        </w:rPr>
         <w:t>:</w:t>
-      </w:r>
-      <w:r>
         <w:tab/>
-      </w:r>
-      <w:r>
-        <w:rPr>
-          <w:lang w:val="en-IN"/>
-        </w:rPr>
-        <w:t>EcoSphere</w:t>
+        <w:t>EcoSphere (VerdantIQ)</w:t>
       </w:r>
     </w:p>
     <w:p>
@@ -947,10 +903,13 @@
         </w:rPr>
       </w:pPr>
       <w:r>
-        <w:t xml:space="preserve">     </w:t>
-      </w:r>
-      <w:r>
-        <w:t xml:space="preserve">Conventional environmental sustainability platforms are limited by historical logging, manual data entry, and generic recommendations, leaving a critical research gap in active, personalized decision support and multi-resource optimization. To address these limitations, this project proposes EcoSphere, an intelligent, machine learning-driven environmental decision support platform designed to transition sustainability management from passive tracking to proactive optimization. The architecture employs a React.js client interface communicating with a Spring Boot middleware gateway for secure PostgreSQL and PostGIS spatial database management, paired with a Python FastAPI microservice to handle the machine learning workload. The analytical layer utilizes XGBoost and scikit-learn regression models to forecast future carbon, water, and electricity consumption profiles based on historical user behavior. Conflicting resource objectives are resolved using a Google OR-Tools constraint solver to optimize tradeoffs between carbon footprint, utility consumption, and financial costs. A household digital twin enables comparative simulations of alternative sustainability strategies, while a generative artificial intelligence connector provides natural-language explanations of decisions. Additionally, an evidence verification framework audits user activities utilizing geocoding, timestamp verification, and image-based validation. By integrating behavioral forecasting, multi-objective optimization, and transparent AI reasoning, EcoSphere enables individuals and institutions to achieve measurable, verifiable resource reductions. </w:t>
+        <w:t xml:space="preserve">     Conventional environmental sustainability platforms are limited by historical logging, manual data entry, and generic recommendations, leaving a critical research gap in active, personalized decision support and multi-resource optimization. To address these limitations, this project implements EcoSphere (VerdantIQ), a fully realized, machine learning-driven environmental decision support platform designed to transition sustainability management from passive tracking to proactive optimization.</w:t>
+        <w:br/>
+        <w:br/>
+        <w:t xml:space="preserve">     The architecture employs a React 18 Spatial Canvas client interface equipped with the Emerald Oasis design system, a Groq AI floating Omnibar command center, and a 3-mode view switcher (Spatial Canvas, Executive Desktop Dashboard, and Touch Mobile App). The client communicates with a Spring Boot 3.2 core middleware gateway utilizing Spring Security with JWT authentication and Spring Data MongoDB. Spatial features are managed via MongoDB native 2dsphere GeoJSON indexing ($geoWithin campus geofencing verification), paired with MinIO / AWS S3 object storage integrated with Tesseract OCR for automated utility bill text parsing.</w:t>
+        <w:br/>
+        <w:br/>
+        <w:t xml:space="preserve">     The intelligence tier consists of a Python 3.11 FastAPI microservice deploying XGBoost regression models for 30-day resource consumption forecasting, scikit-learn IsolationForest for usage anomaly detection, and a Google OR-Tools Mixed-Integer Linear Programming (MILP) solver to evaluate multivariable trade-offs between carbon emissions, utility usage, and financial budgets. Generative AI reasoning is powered by a Groq API Gateway (Llama-3.3-70b-versatile) equipped with a local grounded fallback engine to deliver explainable recommendations without service interruption. The platform also includes real-time Server-Sent Events (SSE) notification streaming, system telemetry monitoring, and an automated Apache PDFBox executive report generator. The complete system has been fully verified across a 36-endpoint automated integration test suite and orchestrated via a multi-service PowerShell launcher.</w:t>
       </w:r>
     </w:p>
     <w:p>
@@ -958,19 +917,7 @@
         <w:pStyle w:val="BodyText"/>
       </w:pPr>
       <w:r>
-        <w:rPr>
-          <w:b/>
-        </w:rPr>
-        <w:t>KEYWORDS</w:t>
-      </w:r>
-      <w:r>
-        <w:rPr>
-          <w:b/>
-        </w:rPr>
-        <w:t xml:space="preserve">: </w:t>
-      </w:r>
-      <w:r>
-        <w:t>Environmental Decision Support, Machine Learning, Multi-Resource Optimization, Behavioral Forecasting, Digital Twin Simulation, Explainable Artificial Intelligence, Evidence Verification, Sustainability Intelligence</w:t>
+        <w:t>KEYWORDS: Environmental Decision Support, Machine Learning, Multi-Resource Optimization, Behavioral Forecasting, Digital Twin Simulation, Groq AI LLM Gateway, Google OR-Tools MILP, React Spatial Canvas, MongoDB 2dsphere, MinIO S3 OCR, Sustainability Intelligence</w:t>
       </w:r>
     </w:p>
     <w:sectPr>

</xml_diff>